<commit_message>
Expand feature catalog for a fully functioning system
- New Group 18 Owner Settings & Site Parameters (central settings page):
  cleaning fee as FIXED amount or PER-DAY charge, extra-guest/pet fees,
  deposit default, check-in/out times, stay/gap/blackout rules,
  cancellation policy, house rules, tax rates, currency/payout prefs,
  instant vs request book, discounts, notification prefs, language,
  per-unit overrides
- New Group 19 Notifications & Owner Alerts; Group 20 Account, Security
  & Data (2FA, sessions, data export, DSAR, roles, audit log)
- Added guest receipts/invoices and Mexican CFDI (factura) to tax group
- Captured Owner Settings + cleaning-fee model in CLAUDE.md
- Regenerated PDF + docx

Co-Authored-By: Claude Opus 4.6 <noreply@anthropic.com>
</commit_message>
<xml_diff>
--- a/docs/planning/Familiar_Guest_Feature_Catalog.docx
+++ b/docs/planning/Familiar_Guest_Feature_Catalog.docx
@@ -91,7 +91,7 @@
       <w:r>
         <w:t xml:space="preserve">stylesheet: </w:t>
       </w:r>
-      <w:hyperlink w:history="1" r:id="rIdwajytpksem2sruust004r">
+      <w:hyperlink w:history="1" r:id="rId7iovuu6aqael2nelymaen">
         <w:r>
           <w:rPr>
             <w:rStyle w:val="MdLink"/>
@@ -1450,7 +1450,15 @@
               <w:pStyle w:val="MdTableCell"/>
             </w:pPr>
             <w:r>
-              <w:t xml:space="preserve">Cleaning fee / extra-guest fee config</w:t>
+              <w:t xml:space="preserve">Cleaning fee — </w:t>
+            </w:r>
+            <w:r>
+              <w:rPr>
+                <w:rStyle w:val="MdStrong"/>
+                <w:b/>
+                <w:bCs/>
+              </w:rPr>
+              <w:t xml:space="preserve">fixed amount or per-day charge</w:t>
             </w:r>
           </w:p>
         </w:tc>
@@ -1488,7 +1496,63 @@
               <w:pStyle w:val="MdTableCell"/>
             </w:pPr>
             <w:r>
-              <w:t xml:space="preserve">Per-booking fees</w:t>
+              <w:t xml:space="preserve">Owner chooses the model; set in Owner Settings (group 18), per-unit override</w:t>
+            </w:r>
+          </w:p>
+        </w:tc>
+      </w:tr>
+      <w:tr>
+        <w:trPr>
+          <w:cantSplit/>
+        </w:trPr>
+        <w:tc>
+          <w:tcPr>
+            <w:vAlign w:val="center"/>
+          </w:tcPr>
+          <w:p>
+            <w:pPr>
+              <w:pStyle w:val="MdTableCell"/>
+            </w:pPr>
+            <w:r>
+              <w:t xml:space="preserve">Extra-guest fee &amp;amp; pet fee</w:t>
+            </w:r>
+          </w:p>
+        </w:tc>
+        <w:tc>
+          <w:tcPr>
+            <w:vAlign w:val="center"/>
+          </w:tcPr>
+          <w:p>
+            <w:pPr>
+              <w:pStyle w:val="MdTableCell"/>
+            </w:pPr>
+            <w:r>
+              <w:rPr>
+                <w:rStyle w:val="MdTag"/>
+              </w:rPr>
+              <w:t xml:space="preserve">&lt;span class="tag new"&gt;</w:t>
+            </w:r>
+            <w:r>
+              <w:t xml:space="preserve">NEW</w:t>
+            </w:r>
+            <w:r>
+              <w:rPr>
+                <w:rStyle w:val="MdTag"/>
+              </w:rPr>
+              <w:t xml:space="preserve">&lt;/span&gt;</w:t>
+            </w:r>
+          </w:p>
+        </w:tc>
+        <w:tc>
+          <w:tcPr>
+            <w:vAlign w:val="center"/>
+          </w:tcPr>
+          <w:p>
+            <w:pPr>
+              <w:pStyle w:val="MdTableCell"/>
+            </w:pPr>
+            <w:r>
+              <w:t xml:space="preserve">Optional per-booking fees</w:t>
             </w:r>
           </w:p>
         </w:tc>
@@ -7436,6 +7500,118 @@
               <w:pStyle w:val="MdTableCell"/>
             </w:pPr>
             <w:r>
+              <w:t xml:space="preserve">Guest receipts / booking invoices</w:t>
+            </w:r>
+          </w:p>
+        </w:tc>
+        <w:tc>
+          <w:tcPr>
+            <w:vAlign w:val="center"/>
+          </w:tcPr>
+          <w:p>
+            <w:pPr>
+              <w:pStyle w:val="MdTableCell"/>
+            </w:pPr>
+            <w:r>
+              <w:rPr>
+                <w:rStyle w:val="MdTag"/>
+              </w:rPr>
+              <w:t xml:space="preserve">&lt;span class="tag new"&gt;</w:t>
+            </w:r>
+            <w:r>
+              <w:t xml:space="preserve">NEW</w:t>
+            </w:r>
+            <w:r>
+              <w:rPr>
+                <w:rStyle w:val="MdTag"/>
+              </w:rPr>
+              <w:t xml:space="preserve">&lt;/span&gt;</w:t>
+            </w:r>
+          </w:p>
+        </w:tc>
+        <w:tc>
+          <w:tcPr>
+            <w:vAlign w:val="center"/>
+          </w:tcPr>
+          <w:p>
+            <w:pPr>
+              <w:pStyle w:val="MdTableCell"/>
+            </w:pPr>
+            <w:r>
+              <w:t xml:space="preserve">Per booking</w:t>
+            </w:r>
+          </w:p>
+        </w:tc>
+      </w:tr>
+      <w:tr>
+        <w:trPr>
+          <w:cantSplit/>
+        </w:trPr>
+        <w:tc>
+          <w:tcPr>
+            <w:vAlign w:val="center"/>
+          </w:tcPr>
+          <w:p>
+            <w:pPr>
+              <w:pStyle w:val="MdTableCell"/>
+            </w:pPr>
+            <w:r>
+              <w:t xml:space="preserve">Mexican electronic invoice (CFDI / factura via SAT)</w:t>
+            </w:r>
+          </w:p>
+        </w:tc>
+        <w:tc>
+          <w:tcPr>
+            <w:vAlign w:val="center"/>
+          </w:tcPr>
+          <w:p>
+            <w:pPr>
+              <w:pStyle w:val="MdTableCell"/>
+            </w:pPr>
+            <w:r>
+              <w:rPr>
+                <w:rStyle w:val="MdTag"/>
+              </w:rPr>
+              <w:t xml:space="preserve">&lt;span class="tag new"&gt;</w:t>
+            </w:r>
+            <w:r>
+              <w:t xml:space="preserve">NEW</w:t>
+            </w:r>
+            <w:r>
+              <w:rPr>
+                <w:rStyle w:val="MdTag"/>
+              </w:rPr>
+              <w:t xml:space="preserve">&lt;/span&gt;</w:t>
+            </w:r>
+          </w:p>
+        </w:tc>
+        <w:tc>
+          <w:tcPr>
+            <w:vAlign w:val="center"/>
+          </w:tcPr>
+          <w:p>
+            <w:pPr>
+              <w:pStyle w:val="MdTableCell"/>
+            </w:pPr>
+            <w:r>
+              <w:t xml:space="preserve">Often required for Mexican guests; needs SAT integration</w:t>
+            </w:r>
+          </w:p>
+        </w:tc>
+      </w:tr>
+      <w:tr>
+        <w:trPr>
+          <w:cantSplit/>
+        </w:trPr>
+        <w:tc>
+          <w:tcPr>
+            <w:vAlign w:val="center"/>
+          </w:tcPr>
+          <w:p>
+            <w:pPr>
+              <w:pStyle w:val="MdTableCell"/>
+            </w:pPr>
+            <w:r>
               <w:t xml:space="preserve">Payout statements / financial ledger (CSV)</w:t>
             </w:r>
           </w:p>
@@ -9251,6 +9427,1796 @@
     </w:tbl>
     <w:p>
       <w:pPr>
+        <w:pStyle w:val="MdHtml"/>
+      </w:pPr>
+      <w:r>
+        <w:t xml:space="preserve">&lt;div class="page-break"&gt;&lt;/div&gt;
+</w:t>
+      </w:r>
+    </w:p>
+    <w:p>
+      <w:pPr>
+        <w:pStyle w:val="Heading2"/>
+        <w:pStyle w:val="MdHeading2"/>
+      </w:pPr>
+      <w:r>
+        <w:t xml:space="preserve">18 · </w:t>
+      </w:r>
+      <w:r>
+        <w:rPr>
+          <w:rStyle w:val="MdTag"/>
+        </w:rPr>
+        <w:t xml:space="preserve">&lt;span class="grpnum"&gt;</w:t>
+      </w:r>
+      <w:r>
+        <w:t xml:space="preserve">Owner Settings &amp;amp; Site Parameters</w:t>
+      </w:r>
+      <w:r>
+        <w:rPr>
+          <w:rStyle w:val="MdTag"/>
+        </w:rPr>
+        <w:t xml:space="preserve">&lt;/span&gt;</w:t>
+      </w:r>
+    </w:p>
+    <w:p>
+      <w:pPr>
+        <w:pStyle w:val="MdParagraph"/>
+      </w:pPr>
+      <w:r>
+        <w:t xml:space="preserve">A central </w:t>
+      </w:r>
+      <w:r>
+        <w:rPr>
+          <w:rStyle w:val="MdStrong"/>
+          <w:b/>
+          <w:bCs/>
+        </w:rPr>
+        <w:t xml:space="preserve">Settings page</w:t>
+      </w:r>
+      <w:r>
+        <w:t xml:space="preserve"> where the owner configures policies and parameters once — with per-unit overrides where it makes sense.</w:t>
+      </w:r>
+    </w:p>
+    <w:p>
+      <w:pPr>
+        <w:pStyle w:val="MdSpace"/>
+      </w:pPr>
+    </w:p>
+    <w:tbl>
+      <w:tblPr>
+        <w:tblStyle w:val="MdTable"/>
+        <w:tblW w:type="pct" w:w="100%"/>
+        <w:tblBorders>
+          <w:top w:val="single" w:color="auto" w:sz="4"/>
+          <w:left w:val="single" w:color="auto" w:sz="4"/>
+          <w:bottom w:val="single" w:color="auto" w:sz="4"/>
+          <w:right w:val="single" w:color="auto" w:sz="4"/>
+          <w:insideH w:val="single" w:color="auto" w:sz="4"/>
+          <w:insideV w:val="single" w:color="auto" w:sz="4"/>
+        </w:tblBorders>
+      </w:tblPr>
+      <w:tblGrid>
+        <w:gridCol w:w="3333"/>
+        <w:gridCol w:w="3333"/>
+        <w:gridCol w:w="3333"/>
+      </w:tblGrid>
+      <w:tr>
+        <w:trPr>
+          <w:cantSplit/>
+          <w:tblHeader/>
+        </w:trPr>
+        <w:tc>
+          <w:tcPr>
+            <w:shd w:fill="F2F2F2"/>
+            <w:vAlign w:val="center"/>
+          </w:tcPr>
+          <w:p>
+            <w:pPr>
+              <w:pStyle w:val="MdTableHeader"/>
+            </w:pPr>
+            <w:r>
+              <w:t xml:space="preserve">Feature</w:t>
+            </w:r>
+          </w:p>
+        </w:tc>
+        <w:tc>
+          <w:tcPr>
+            <w:shd w:fill="F2F2F2"/>
+            <w:vAlign w:val="center"/>
+          </w:tcPr>
+          <w:p>
+            <w:pPr>
+              <w:pStyle w:val="MdTableHeader"/>
+            </w:pPr>
+            <w:r>
+              <w:t xml:space="preserve">Status</w:t>
+            </w:r>
+          </w:p>
+        </w:tc>
+        <w:tc>
+          <w:tcPr>
+            <w:shd w:fill="F2F2F2"/>
+            <w:vAlign w:val="center"/>
+          </w:tcPr>
+          <w:p>
+            <w:pPr>
+              <w:pStyle w:val="MdTableHeader"/>
+            </w:pPr>
+            <w:r>
+              <w:t xml:space="preserve">Notes</w:t>
+            </w:r>
+          </w:p>
+        </w:tc>
+      </w:tr>
+      <w:tr>
+        <w:trPr>
+          <w:cantSplit/>
+        </w:trPr>
+        <w:tc>
+          <w:tcPr>
+            <w:vAlign w:val="center"/>
+          </w:tcPr>
+          <w:p>
+            <w:pPr>
+              <w:pStyle w:val="MdTableCell"/>
+            </w:pPr>
+            <w:r>
+              <w:t xml:space="preserve">Central Owner Settings page</w:t>
+            </w:r>
+          </w:p>
+        </w:tc>
+        <w:tc>
+          <w:tcPr>
+            <w:vAlign w:val="center"/>
+          </w:tcPr>
+          <w:p>
+            <w:pPr>
+              <w:pStyle w:val="MdTableCell"/>
+            </w:pPr>
+            <w:r>
+              <w:rPr>
+                <w:rStyle w:val="MdTag"/>
+              </w:rPr>
+              <w:t xml:space="preserve">&lt;span class="tag new"&gt;</w:t>
+            </w:r>
+            <w:r>
+              <w:t xml:space="preserve">NEW</w:t>
+            </w:r>
+            <w:r>
+              <w:rPr>
+                <w:rStyle w:val="MdTag"/>
+              </w:rPr>
+              <w:t xml:space="preserve">&lt;/span&gt;</w:t>
+            </w:r>
+          </w:p>
+        </w:tc>
+        <w:tc>
+          <w:tcPr>
+            <w:vAlign w:val="center"/>
+          </w:tcPr>
+          <w:p>
+            <w:pPr>
+              <w:pStyle w:val="MdTableCell"/>
+            </w:pPr>
+            <w:r>
+              <w:t xml:space="preserve">One place for all policies/parameters</w:t>
+            </w:r>
+          </w:p>
+        </w:tc>
+      </w:tr>
+      <w:tr>
+        <w:trPr>
+          <w:cantSplit/>
+        </w:trPr>
+        <w:tc>
+          <w:tcPr>
+            <w:vAlign w:val="center"/>
+          </w:tcPr>
+          <w:p>
+            <w:pPr>
+              <w:pStyle w:val="MdTableCell"/>
+            </w:pPr>
+            <w:r>
+              <w:rPr>
+                <w:rStyle w:val="MdStrong"/>
+                <w:b/>
+                <w:bCs/>
+              </w:rPr>
+              <w:t xml:space="preserve">Cleaning fee — fixed amount OR per-day charge</w:t>
+            </w:r>
+          </w:p>
+        </w:tc>
+        <w:tc>
+          <w:tcPr>
+            <w:vAlign w:val="center"/>
+          </w:tcPr>
+          <w:p>
+            <w:pPr>
+              <w:pStyle w:val="MdTableCell"/>
+            </w:pPr>
+            <w:r>
+              <w:rPr>
+                <w:rStyle w:val="MdTag"/>
+              </w:rPr>
+              <w:t xml:space="preserve">&lt;span class="tag new"&gt;</w:t>
+            </w:r>
+            <w:r>
+              <w:t xml:space="preserve">NEW</w:t>
+            </w:r>
+            <w:r>
+              <w:rPr>
+                <w:rStyle w:val="MdTag"/>
+              </w:rPr>
+              <w:t xml:space="preserve">&lt;/span&gt;</w:t>
+            </w:r>
+          </w:p>
+        </w:tc>
+        <w:tc>
+          <w:tcPr>
+            <w:vAlign w:val="center"/>
+          </w:tcPr>
+          <w:p>
+            <w:pPr>
+              <w:pStyle w:val="MdTableCell"/>
+            </w:pPr>
+            <w:r>
+              <w:t xml:space="preserve">Owner picks the model; per-unit override</w:t>
+            </w:r>
+          </w:p>
+        </w:tc>
+      </w:tr>
+      <w:tr>
+        <w:trPr>
+          <w:cantSplit/>
+        </w:trPr>
+        <w:tc>
+          <w:tcPr>
+            <w:vAlign w:val="center"/>
+          </w:tcPr>
+          <w:p>
+            <w:pPr>
+              <w:pStyle w:val="MdTableCell"/>
+            </w:pPr>
+            <w:r>
+              <w:t xml:space="preserve">Extra-guest fee &amp;amp; pet fee</w:t>
+            </w:r>
+          </w:p>
+        </w:tc>
+        <w:tc>
+          <w:tcPr>
+            <w:vAlign w:val="center"/>
+          </w:tcPr>
+          <w:p>
+            <w:pPr>
+              <w:pStyle w:val="MdTableCell"/>
+            </w:pPr>
+            <w:r>
+              <w:rPr>
+                <w:rStyle w:val="MdTag"/>
+              </w:rPr>
+              <w:t xml:space="preserve">&lt;span class="tag new"&gt;</w:t>
+            </w:r>
+            <w:r>
+              <w:t xml:space="preserve">NEW</w:t>
+            </w:r>
+            <w:r>
+              <w:rPr>
+                <w:rStyle w:val="MdTag"/>
+              </w:rPr>
+              <w:t xml:space="preserve">&lt;/span&gt;</w:t>
+            </w:r>
+          </w:p>
+        </w:tc>
+        <w:tc>
+          <w:tcPr>
+            <w:vAlign w:val="center"/>
+          </w:tcPr>
+          <w:p>
+            <w:pPr>
+              <w:pStyle w:val="MdTableCell"/>
+            </w:pPr>
+            <w:r>
+              <w:t xml:space="preserve">Optional per-booking</w:t>
+            </w:r>
+          </w:p>
+        </w:tc>
+      </w:tr>
+      <w:tr>
+        <w:trPr>
+          <w:cantSplit/>
+        </w:trPr>
+        <w:tc>
+          <w:tcPr>
+            <w:vAlign w:val="center"/>
+          </w:tcPr>
+          <w:p>
+            <w:pPr>
+              <w:pStyle w:val="MdTableCell"/>
+            </w:pPr>
+            <w:r>
+              <w:t xml:space="preserve">Damage-deposit default</w:t>
+            </w:r>
+          </w:p>
+        </w:tc>
+        <w:tc>
+          <w:tcPr>
+            <w:vAlign w:val="center"/>
+          </w:tcPr>
+          <w:p>
+            <w:pPr>
+              <w:pStyle w:val="MdTableCell"/>
+            </w:pPr>
+            <w:r>
+              <w:rPr>
+                <w:rStyle w:val="MdTag"/>
+              </w:rPr>
+              <w:t xml:space="preserve">&lt;span class="tag core"&gt;</w:t>
+            </w:r>
+            <w:r>
+              <w:t xml:space="preserve">CORE</w:t>
+            </w:r>
+            <w:r>
+              <w:rPr>
+                <w:rStyle w:val="MdTag"/>
+              </w:rPr>
+              <w:t xml:space="preserve">&lt;/span&gt;</w:t>
+            </w:r>
+          </w:p>
+        </w:tc>
+        <w:tc>
+          <w:tcPr>
+            <w:vAlign w:val="center"/>
+          </w:tcPr>
+          <w:p>
+            <w:pPr>
+              <w:pStyle w:val="MdTableCell"/>
+            </w:pPr>
+            <w:r>
+              <w:t xml:space="preserve">Per-unit override</w:t>
+            </w:r>
+          </w:p>
+        </w:tc>
+      </w:tr>
+      <w:tr>
+        <w:trPr>
+          <w:cantSplit/>
+        </w:trPr>
+        <w:tc>
+          <w:tcPr>
+            <w:vAlign w:val="center"/>
+          </w:tcPr>
+          <w:p>
+            <w:pPr>
+              <w:pStyle w:val="MdTableCell"/>
+            </w:pPr>
+            <w:r>
+              <w:t xml:space="preserve">Check-in / check-out times</w:t>
+            </w:r>
+          </w:p>
+        </w:tc>
+        <w:tc>
+          <w:tcPr>
+            <w:vAlign w:val="center"/>
+          </w:tcPr>
+          <w:p>
+            <w:pPr>
+              <w:pStyle w:val="MdTableCell"/>
+            </w:pPr>
+            <w:r>
+              <w:rPr>
+                <w:rStyle w:val="MdTag"/>
+              </w:rPr>
+              <w:t xml:space="preserve">&lt;span class="tag new"&gt;</w:t>
+            </w:r>
+            <w:r>
+              <w:t xml:space="preserve">NEW</w:t>
+            </w:r>
+            <w:r>
+              <w:rPr>
+                <w:rStyle w:val="MdTag"/>
+              </w:rPr>
+              <w:t xml:space="preserve">&lt;/span&gt;</w:t>
+            </w:r>
+          </w:p>
+        </w:tc>
+        <w:tc>
+          <w:tcPr>
+            <w:vAlign w:val="center"/>
+          </w:tcPr>
+          <w:p>
+            <w:pPr>
+              <w:pStyle w:val="MdTableCell"/>
+            </w:pPr>
+            <w:r>
+              <w:t xml:space="preserve">Drives messaging + house manual</w:t>
+            </w:r>
+          </w:p>
+        </w:tc>
+      </w:tr>
+      <w:tr>
+        <w:trPr>
+          <w:cantSplit/>
+        </w:trPr>
+        <w:tc>
+          <w:tcPr>
+            <w:vAlign w:val="center"/>
+          </w:tcPr>
+          <w:p>
+            <w:pPr>
+              <w:pStyle w:val="MdTableCell"/>
+            </w:pPr>
+            <w:r>
+              <w:t xml:space="preserve">Min/max nights, gap &amp;amp; blackout rules</w:t>
+            </w:r>
+          </w:p>
+        </w:tc>
+        <w:tc>
+          <w:tcPr>
+            <w:vAlign w:val="center"/>
+          </w:tcPr>
+          <w:p>
+            <w:pPr>
+              <w:pStyle w:val="MdTableCell"/>
+            </w:pPr>
+            <w:r>
+              <w:rPr>
+                <w:rStyle w:val="MdTag"/>
+              </w:rPr>
+              <w:t xml:space="preserve">&lt;span class="tag new"&gt;</w:t>
+            </w:r>
+            <w:r>
+              <w:t xml:space="preserve">NEW</w:t>
+            </w:r>
+            <w:r>
+              <w:rPr>
+                <w:rStyle w:val="MdTag"/>
+              </w:rPr>
+              <w:t xml:space="preserve">&lt;/span&gt;</w:t>
+            </w:r>
+          </w:p>
+        </w:tc>
+        <w:tc>
+          <w:tcPr>
+            <w:vAlign w:val="center"/>
+          </w:tcPr>
+          <w:p>
+            <w:pPr>
+              <w:pStyle w:val="MdTableCell"/>
+            </w:pPr>
+            <w:r>
+              <w:t xml:space="preserve">Availability policy</w:t>
+            </w:r>
+          </w:p>
+        </w:tc>
+      </w:tr>
+      <w:tr>
+        <w:trPr>
+          <w:cantSplit/>
+        </w:trPr>
+        <w:tc>
+          <w:tcPr>
+            <w:vAlign w:val="center"/>
+          </w:tcPr>
+          <w:p>
+            <w:pPr>
+              <w:pStyle w:val="MdTableCell"/>
+            </w:pPr>
+            <w:r>
+              <w:t xml:space="preserve">Cancellation policy (flexible / moderate / strict)</w:t>
+            </w:r>
+          </w:p>
+        </w:tc>
+        <w:tc>
+          <w:tcPr>
+            <w:vAlign w:val="center"/>
+          </w:tcPr>
+          <w:p>
+            <w:pPr>
+              <w:pStyle w:val="MdTableCell"/>
+            </w:pPr>
+            <w:r>
+              <w:rPr>
+                <w:rStyle w:val="MdTag"/>
+              </w:rPr>
+              <w:t xml:space="preserve">&lt;span class="tag new"&gt;</w:t>
+            </w:r>
+            <w:r>
+              <w:t xml:space="preserve">NEW</w:t>
+            </w:r>
+            <w:r>
+              <w:rPr>
+                <w:rStyle w:val="MdTag"/>
+              </w:rPr>
+              <w:t xml:space="preserve">&lt;/span&gt;</w:t>
+            </w:r>
+          </w:p>
+        </w:tc>
+        <w:tc>
+          <w:tcPr>
+            <w:vAlign w:val="center"/>
+          </w:tcPr>
+          <w:p>
+            <w:pPr>
+              <w:pStyle w:val="MdTableCell"/>
+            </w:pPr>
+            <w:r>
+              <w:t xml:space="preserve">Drives the refund flow</w:t>
+            </w:r>
+          </w:p>
+        </w:tc>
+      </w:tr>
+      <w:tr>
+        <w:trPr>
+          <w:cantSplit/>
+        </w:trPr>
+        <w:tc>
+          <w:tcPr>
+            <w:vAlign w:val="center"/>
+          </w:tcPr>
+          <w:p>
+            <w:pPr>
+              <w:pStyle w:val="MdTableCell"/>
+            </w:pPr>
+            <w:r>
+              <w:t xml:space="preserve">House rules &amp;amp; quiet hours</w:t>
+            </w:r>
+          </w:p>
+        </w:tc>
+        <w:tc>
+          <w:tcPr>
+            <w:vAlign w:val="center"/>
+          </w:tcPr>
+          <w:p>
+            <w:pPr>
+              <w:pStyle w:val="MdTableCell"/>
+            </w:pPr>
+            <w:r>
+              <w:rPr>
+                <w:rStyle w:val="MdTag"/>
+              </w:rPr>
+              <w:t xml:space="preserve">&lt;span class="tag new"&gt;</w:t>
+            </w:r>
+            <w:r>
+              <w:t xml:space="preserve">NEW</w:t>
+            </w:r>
+            <w:r>
+              <w:rPr>
+                <w:rStyle w:val="MdTag"/>
+              </w:rPr>
+              <w:t xml:space="preserve">&lt;/span&gt;</w:t>
+            </w:r>
+          </w:p>
+        </w:tc>
+        <w:tc>
+          <w:tcPr>
+            <w:vAlign w:val="center"/>
+          </w:tcPr>
+          <w:p>
+            <w:pPr>
+              <w:pStyle w:val="MdTableCell"/>
+            </w:pPr>
+            <w:r>
+              <w:t xml:space="preserve">Shown to guest</w:t>
+            </w:r>
+          </w:p>
+        </w:tc>
+      </w:tr>
+      <w:tr>
+        <w:trPr>
+          <w:cantSplit/>
+        </w:trPr>
+        <w:tc>
+          <w:tcPr>
+            <w:vAlign w:val="center"/>
+          </w:tcPr>
+          <w:p>
+            <w:pPr>
+              <w:pStyle w:val="MdTableCell"/>
+            </w:pPr>
+            <w:r>
+              <w:t xml:space="preserve">Lodging-tax rates by jurisdiction</w:t>
+            </w:r>
+          </w:p>
+        </w:tc>
+        <w:tc>
+          <w:tcPr>
+            <w:vAlign w:val="center"/>
+          </w:tcPr>
+          <w:p>
+            <w:pPr>
+              <w:pStyle w:val="MdTableCell"/>
+            </w:pPr>
+            <w:r>
+              <w:rPr>
+                <w:rStyle w:val="MdTag"/>
+              </w:rPr>
+              <w:t xml:space="preserve">&lt;span class="tag new"&gt;</w:t>
+            </w:r>
+            <w:r>
+              <w:t xml:space="preserve">NEW</w:t>
+            </w:r>
+            <w:r>
+              <w:rPr>
+                <w:rStyle w:val="MdTag"/>
+              </w:rPr>
+              <w:t xml:space="preserve">&lt;/span&gt;</w:t>
+            </w:r>
+          </w:p>
+        </w:tc>
+        <w:tc>
+          <w:tcPr>
+            <w:vAlign w:val="center"/>
+          </w:tcPr>
+          <w:p>
+            <w:pPr>
+              <w:pStyle w:val="MdTableCell"/>
+            </w:pPr>
+            <w:r>
+              <w:t xml:space="preserve">Feeds tax accounting</w:t>
+            </w:r>
+          </w:p>
+        </w:tc>
+      </w:tr>
+      <w:tr>
+        <w:trPr>
+          <w:cantSplit/>
+        </w:trPr>
+        <w:tc>
+          <w:tcPr>
+            <w:vAlign w:val="center"/>
+          </w:tcPr>
+          <w:p>
+            <w:pPr>
+              <w:pStyle w:val="MdTableCell"/>
+            </w:pPr>
+            <w:r>
+              <w:t xml:space="preserve">Default currency &amp;amp; payout preferences</w:t>
+            </w:r>
+          </w:p>
+        </w:tc>
+        <w:tc>
+          <w:tcPr>
+            <w:vAlign w:val="center"/>
+          </w:tcPr>
+          <w:p>
+            <w:pPr>
+              <w:pStyle w:val="MdTableCell"/>
+            </w:pPr>
+            <w:r>
+              <w:rPr>
+                <w:rStyle w:val="MdTag"/>
+              </w:rPr>
+              <w:t xml:space="preserve">&lt;span class="tag new"&gt;</w:t>
+            </w:r>
+            <w:r>
+              <w:t xml:space="preserve">NEW</w:t>
+            </w:r>
+            <w:r>
+              <w:rPr>
+                <w:rStyle w:val="MdTag"/>
+              </w:rPr>
+              <w:t xml:space="preserve">&lt;/span&gt;</w:t>
+            </w:r>
+          </w:p>
+        </w:tc>
+        <w:tc>
+          <w:tcPr>
+            <w:vAlign w:val="center"/>
+          </w:tcPr>
+          <w:p>
+            <w:pPr>
+              <w:pStyle w:val="MdTableCell"/>
+            </w:pPr>
+          </w:p>
+        </w:tc>
+      </w:tr>
+      <w:tr>
+        <w:trPr>
+          <w:cantSplit/>
+        </w:trPr>
+        <w:tc>
+          <w:tcPr>
+            <w:vAlign w:val="center"/>
+          </w:tcPr>
+          <w:p>
+            <w:pPr>
+              <w:pStyle w:val="MdTableCell"/>
+            </w:pPr>
+            <w:r>
+              <w:t xml:space="preserve">Instant-book vs request-to-book default</w:t>
+            </w:r>
+          </w:p>
+        </w:tc>
+        <w:tc>
+          <w:tcPr>
+            <w:vAlign w:val="center"/>
+          </w:tcPr>
+          <w:p>
+            <w:pPr>
+              <w:pStyle w:val="MdTableCell"/>
+            </w:pPr>
+            <w:r>
+              <w:rPr>
+                <w:rStyle w:val="MdTag"/>
+              </w:rPr>
+              <w:t xml:space="preserve">&lt;span class="tag new"&gt;</w:t>
+            </w:r>
+            <w:r>
+              <w:t xml:space="preserve">NEW</w:t>
+            </w:r>
+            <w:r>
+              <w:rPr>
+                <w:rStyle w:val="MdTag"/>
+              </w:rPr>
+              <w:t xml:space="preserve">&lt;/span&gt;</w:t>
+            </w:r>
+          </w:p>
+        </w:tc>
+        <w:tc>
+          <w:tcPr>
+            <w:vAlign w:val="center"/>
+          </w:tcPr>
+          <w:p>
+            <w:pPr>
+              <w:pStyle w:val="MdTableCell"/>
+            </w:pPr>
+            <w:r>
+              <w:t xml:space="preserve">Per unit / guest tier</w:t>
+            </w:r>
+          </w:p>
+        </w:tc>
+      </w:tr>
+      <w:tr>
+        <w:trPr>
+          <w:cantSplit/>
+        </w:trPr>
+        <w:tc>
+          <w:tcPr>
+            <w:vAlign w:val="center"/>
+          </w:tcPr>
+          <w:p>
+            <w:pPr>
+              <w:pStyle w:val="MdTableCell"/>
+            </w:pPr>
+            <w:r>
+              <w:t xml:space="preserve">Guest discount rules (returning / long-stay / last-minute)</w:t>
+            </w:r>
+          </w:p>
+        </w:tc>
+        <w:tc>
+          <w:tcPr>
+            <w:vAlign w:val="center"/>
+          </w:tcPr>
+          <w:p>
+            <w:pPr>
+              <w:pStyle w:val="MdTableCell"/>
+            </w:pPr>
+            <w:r>
+              <w:rPr>
+                <w:rStyle w:val="MdTag"/>
+              </w:rPr>
+              <w:t xml:space="preserve">&lt;span class="tag new"&gt;</w:t>
+            </w:r>
+            <w:r>
+              <w:t xml:space="preserve">NEW</w:t>
+            </w:r>
+            <w:r>
+              <w:rPr>
+                <w:rStyle w:val="MdTag"/>
+              </w:rPr>
+              <w:t xml:space="preserve">&lt;/span&gt;</w:t>
+            </w:r>
+          </w:p>
+        </w:tc>
+        <w:tc>
+          <w:tcPr>
+            <w:vAlign w:val="center"/>
+          </w:tcPr>
+          <w:p>
+            <w:pPr>
+              <w:pStyle w:val="MdTableCell"/>
+            </w:pPr>
+            <w:r>
+              <w:t xml:space="preserve">Owner-set price tiers</w:t>
+            </w:r>
+          </w:p>
+        </w:tc>
+      </w:tr>
+      <w:tr>
+        <w:trPr>
+          <w:cantSplit/>
+        </w:trPr>
+        <w:tc>
+          <w:tcPr>
+            <w:vAlign w:val="center"/>
+          </w:tcPr>
+          <w:p>
+            <w:pPr>
+              <w:pStyle w:val="MdTableCell"/>
+            </w:pPr>
+            <w:r>
+              <w:t xml:space="preserve">Message &amp;amp; notification preferences (channels, timing)</w:t>
+            </w:r>
+          </w:p>
+        </w:tc>
+        <w:tc>
+          <w:tcPr>
+            <w:vAlign w:val="center"/>
+          </w:tcPr>
+          <w:p>
+            <w:pPr>
+              <w:pStyle w:val="MdTableCell"/>
+            </w:pPr>
+            <w:r>
+              <w:rPr>
+                <w:rStyle w:val="MdTag"/>
+              </w:rPr>
+              <w:t xml:space="preserve">&lt;span class="tag new"&gt;</w:t>
+            </w:r>
+            <w:r>
+              <w:t xml:space="preserve">NEW</w:t>
+            </w:r>
+            <w:r>
+              <w:rPr>
+                <w:rStyle w:val="MdTag"/>
+              </w:rPr>
+              <w:t xml:space="preserve">&lt;/span&gt;</w:t>
+            </w:r>
+          </w:p>
+        </w:tc>
+        <w:tc>
+          <w:tcPr>
+            <w:vAlign w:val="center"/>
+          </w:tcPr>
+          <w:p>
+            <w:pPr>
+              <w:pStyle w:val="MdTableCell"/>
+            </w:pPr>
+            <w:r>
+              <w:t xml:space="preserve">SMS/WhatsApp/email + quiet hours</w:t>
+            </w:r>
+          </w:p>
+        </w:tc>
+      </w:tr>
+      <w:tr>
+        <w:trPr>
+          <w:cantSplit/>
+        </w:trPr>
+        <w:tc>
+          <w:tcPr>
+            <w:vAlign w:val="center"/>
+          </w:tcPr>
+          <w:p>
+            <w:pPr>
+              <w:pStyle w:val="MdTableCell"/>
+            </w:pPr>
+            <w:r>
+              <w:t xml:space="preserve">Default language (EN/ES)</w:t>
+            </w:r>
+          </w:p>
+        </w:tc>
+        <w:tc>
+          <w:tcPr>
+            <w:vAlign w:val="center"/>
+          </w:tcPr>
+          <w:p>
+            <w:pPr>
+              <w:pStyle w:val="MdTableCell"/>
+            </w:pPr>
+            <w:r>
+              <w:rPr>
+                <w:rStyle w:val="MdTag"/>
+              </w:rPr>
+              <w:t xml:space="preserve">&lt;span class="tag new"&gt;</w:t>
+            </w:r>
+            <w:r>
+              <w:t xml:space="preserve">NEW</w:t>
+            </w:r>
+            <w:r>
+              <w:rPr>
+                <w:rStyle w:val="MdTag"/>
+              </w:rPr>
+              <w:t xml:space="preserve">&lt;/span&gt;</w:t>
+            </w:r>
+          </w:p>
+        </w:tc>
+        <w:tc>
+          <w:tcPr>
+            <w:vAlign w:val="center"/>
+          </w:tcPr>
+          <w:p>
+            <w:pPr>
+              <w:pStyle w:val="MdTableCell"/>
+            </w:pPr>
+          </w:p>
+        </w:tc>
+      </w:tr>
+      <w:tr>
+        <w:trPr>
+          <w:cantSplit/>
+        </w:trPr>
+        <w:tc>
+          <w:tcPr>
+            <w:vAlign w:val="center"/>
+          </w:tcPr>
+          <w:p>
+            <w:pPr>
+              <w:pStyle w:val="MdTableCell"/>
+            </w:pPr>
+            <w:r>
+              <w:t xml:space="preserve">Per-unit overrides of global settings</w:t>
+            </w:r>
+          </w:p>
+        </w:tc>
+        <w:tc>
+          <w:tcPr>
+            <w:vAlign w:val="center"/>
+          </w:tcPr>
+          <w:p>
+            <w:pPr>
+              <w:pStyle w:val="MdTableCell"/>
+            </w:pPr>
+            <w:r>
+              <w:rPr>
+                <w:rStyle w:val="MdTag"/>
+              </w:rPr>
+              <w:t xml:space="preserve">&lt;span class="tag new"&gt;</w:t>
+            </w:r>
+            <w:r>
+              <w:t xml:space="preserve">NEW</w:t>
+            </w:r>
+            <w:r>
+              <w:rPr>
+                <w:rStyle w:val="MdTag"/>
+              </w:rPr>
+              <w:t xml:space="preserve">&lt;/span&gt;</w:t>
+            </w:r>
+          </w:p>
+        </w:tc>
+        <w:tc>
+          <w:tcPr>
+            <w:vAlign w:val="center"/>
+          </w:tcPr>
+          <w:p>
+            <w:pPr>
+              <w:pStyle w:val="MdTableCell"/>
+            </w:pPr>
+            <w:r>
+              <w:t xml:space="preserve">Compounds with varied units</w:t>
+            </w:r>
+          </w:p>
+        </w:tc>
+      </w:tr>
+    </w:tbl>
+    <w:p>
+      <w:pPr>
+        <w:pStyle w:val="Heading2"/>
+        <w:pStyle w:val="MdHeading2"/>
+      </w:pPr>
+      <w:r>
+        <w:t xml:space="preserve">19 · </w:t>
+      </w:r>
+      <w:r>
+        <w:rPr>
+          <w:rStyle w:val="MdTag"/>
+        </w:rPr>
+        <w:t xml:space="preserve">&lt;span class="grpnum"&gt;</w:t>
+      </w:r>
+      <w:r>
+        <w:t xml:space="preserve">Notifications &amp;amp; Owner Alerts</w:t>
+      </w:r>
+      <w:r>
+        <w:rPr>
+          <w:rStyle w:val="MdTag"/>
+        </w:rPr>
+        <w:t xml:space="preserve">&lt;/span&gt;</w:t>
+      </w:r>
+    </w:p>
+    <w:tbl>
+      <w:tblPr>
+        <w:tblStyle w:val="MdTable"/>
+        <w:tblW w:type="pct" w:w="100%"/>
+        <w:tblBorders>
+          <w:top w:val="single" w:color="auto" w:sz="4"/>
+          <w:left w:val="single" w:color="auto" w:sz="4"/>
+          <w:bottom w:val="single" w:color="auto" w:sz="4"/>
+          <w:right w:val="single" w:color="auto" w:sz="4"/>
+          <w:insideH w:val="single" w:color="auto" w:sz="4"/>
+          <w:insideV w:val="single" w:color="auto" w:sz="4"/>
+        </w:tblBorders>
+      </w:tblPr>
+      <w:tblGrid>
+        <w:gridCol w:w="3333"/>
+        <w:gridCol w:w="3333"/>
+        <w:gridCol w:w="3333"/>
+      </w:tblGrid>
+      <w:tr>
+        <w:trPr>
+          <w:cantSplit/>
+          <w:tblHeader/>
+        </w:trPr>
+        <w:tc>
+          <w:tcPr>
+            <w:shd w:fill="F2F2F2"/>
+            <w:vAlign w:val="center"/>
+          </w:tcPr>
+          <w:p>
+            <w:pPr>
+              <w:pStyle w:val="MdTableHeader"/>
+            </w:pPr>
+            <w:r>
+              <w:t xml:space="preserve">Feature</w:t>
+            </w:r>
+          </w:p>
+        </w:tc>
+        <w:tc>
+          <w:tcPr>
+            <w:shd w:fill="F2F2F2"/>
+            <w:vAlign w:val="center"/>
+          </w:tcPr>
+          <w:p>
+            <w:pPr>
+              <w:pStyle w:val="MdTableHeader"/>
+            </w:pPr>
+            <w:r>
+              <w:t xml:space="preserve">Status</w:t>
+            </w:r>
+          </w:p>
+        </w:tc>
+        <w:tc>
+          <w:tcPr>
+            <w:shd w:fill="F2F2F2"/>
+            <w:vAlign w:val="center"/>
+          </w:tcPr>
+          <w:p>
+            <w:pPr>
+              <w:pStyle w:val="MdTableHeader"/>
+            </w:pPr>
+            <w:r>
+              <w:t xml:space="preserve">Notes</w:t>
+            </w:r>
+          </w:p>
+        </w:tc>
+      </w:tr>
+      <w:tr>
+        <w:trPr>
+          <w:cantSplit/>
+        </w:trPr>
+        <w:tc>
+          <w:tcPr>
+            <w:vAlign w:val="center"/>
+          </w:tcPr>
+          <w:p>
+            <w:pPr>
+              <w:pStyle w:val="MdTableCell"/>
+            </w:pPr>
+            <w:r>
+              <w:t xml:space="preserve">New-booking / payment-received / cancellation alerts</w:t>
+            </w:r>
+          </w:p>
+        </w:tc>
+        <w:tc>
+          <w:tcPr>
+            <w:vAlign w:val="center"/>
+          </w:tcPr>
+          <w:p>
+            <w:pPr>
+              <w:pStyle w:val="MdTableCell"/>
+            </w:pPr>
+            <w:r>
+              <w:rPr>
+                <w:rStyle w:val="MdTag"/>
+              </w:rPr>
+              <w:t xml:space="preserve">&lt;span class="tag new"&gt;</w:t>
+            </w:r>
+            <w:r>
+              <w:t xml:space="preserve">NEW</w:t>
+            </w:r>
+            <w:r>
+              <w:rPr>
+                <w:rStyle w:val="MdTag"/>
+              </w:rPr>
+              <w:t xml:space="preserve">&lt;/span&gt;</w:t>
+            </w:r>
+          </w:p>
+        </w:tc>
+        <w:tc>
+          <w:tcPr>
+            <w:vAlign w:val="center"/>
+          </w:tcPr>
+          <w:p>
+            <w:pPr>
+              <w:pStyle w:val="MdTableCell"/>
+            </w:pPr>
+          </w:p>
+        </w:tc>
+      </w:tr>
+      <w:tr>
+        <w:trPr>
+          <w:cantSplit/>
+        </w:trPr>
+        <w:tc>
+          <w:tcPr>
+            <w:vAlign w:val="center"/>
+          </w:tcPr>
+          <w:p>
+            <w:pPr>
+              <w:pStyle w:val="MdTableCell"/>
+            </w:pPr>
+            <w:r>
+              <w:t xml:space="preserve">Payout-sent notification</w:t>
+            </w:r>
+          </w:p>
+        </w:tc>
+        <w:tc>
+          <w:tcPr>
+            <w:vAlign w:val="center"/>
+          </w:tcPr>
+          <w:p>
+            <w:pPr>
+              <w:pStyle w:val="MdTableCell"/>
+            </w:pPr>
+            <w:r>
+              <w:rPr>
+                <w:rStyle w:val="MdTag"/>
+              </w:rPr>
+              <w:t xml:space="preserve">&lt;span class="tag new"&gt;</w:t>
+            </w:r>
+            <w:r>
+              <w:t xml:space="preserve">NEW</w:t>
+            </w:r>
+            <w:r>
+              <w:rPr>
+                <w:rStyle w:val="MdTag"/>
+              </w:rPr>
+              <w:t xml:space="preserve">&lt;/span&gt;</w:t>
+            </w:r>
+          </w:p>
+        </w:tc>
+        <w:tc>
+          <w:tcPr>
+            <w:vAlign w:val="center"/>
+          </w:tcPr>
+          <w:p>
+            <w:pPr>
+              <w:pStyle w:val="MdTableCell"/>
+            </w:pPr>
+          </w:p>
+        </w:tc>
+      </w:tr>
+      <w:tr>
+        <w:trPr>
+          <w:cantSplit/>
+        </w:trPr>
+        <w:tc>
+          <w:tcPr>
+            <w:vAlign w:val="center"/>
+          </w:tcPr>
+          <w:p>
+            <w:pPr>
+              <w:pStyle w:val="MdTableCell"/>
+            </w:pPr>
+            <w:r>
+              <w:t xml:space="preserve">New-message alert</w:t>
+            </w:r>
+          </w:p>
+        </w:tc>
+        <w:tc>
+          <w:tcPr>
+            <w:vAlign w:val="center"/>
+          </w:tcPr>
+          <w:p>
+            <w:pPr>
+              <w:pStyle w:val="MdTableCell"/>
+            </w:pPr>
+            <w:r>
+              <w:rPr>
+                <w:rStyle w:val="MdTag"/>
+              </w:rPr>
+              <w:t xml:space="preserve">&lt;span class="tag new"&gt;</w:t>
+            </w:r>
+            <w:r>
+              <w:t xml:space="preserve">NEW</w:t>
+            </w:r>
+            <w:r>
+              <w:rPr>
+                <w:rStyle w:val="MdTag"/>
+              </w:rPr>
+              <w:t xml:space="preserve">&lt;/span&gt;</w:t>
+            </w:r>
+          </w:p>
+        </w:tc>
+        <w:tc>
+          <w:tcPr>
+            <w:vAlign w:val="center"/>
+          </w:tcPr>
+          <w:p>
+            <w:pPr>
+              <w:pStyle w:val="MdTableCell"/>
+            </w:pPr>
+          </w:p>
+        </w:tc>
+      </w:tr>
+      <w:tr>
+        <w:trPr>
+          <w:cantSplit/>
+        </w:trPr>
+        <w:tc>
+          <w:tcPr>
+            <w:vAlign w:val="center"/>
+          </w:tcPr>
+          <w:p>
+            <w:pPr>
+              <w:pStyle w:val="MdTableCell"/>
+            </w:pPr>
+            <w:r>
+              <w:t xml:space="preserve">Calendar-conflict alert</w:t>
+            </w:r>
+          </w:p>
+        </w:tc>
+        <w:tc>
+          <w:tcPr>
+            <w:vAlign w:val="center"/>
+          </w:tcPr>
+          <w:p>
+            <w:pPr>
+              <w:pStyle w:val="MdTableCell"/>
+            </w:pPr>
+            <w:r>
+              <w:rPr>
+                <w:rStyle w:val="MdTag"/>
+              </w:rPr>
+              <w:t xml:space="preserve">&lt;span class="tag new"&gt;</w:t>
+            </w:r>
+            <w:r>
+              <w:t xml:space="preserve">NEW</w:t>
+            </w:r>
+            <w:r>
+              <w:rPr>
+                <w:rStyle w:val="MdTag"/>
+              </w:rPr>
+              <w:t xml:space="preserve">&lt;/span&gt;</w:t>
+            </w:r>
+          </w:p>
+        </w:tc>
+        <w:tc>
+          <w:tcPr>
+            <w:vAlign w:val="center"/>
+          </w:tcPr>
+          <w:p>
+            <w:pPr>
+              <w:pStyle w:val="MdTableCell"/>
+            </w:pPr>
+            <w:r>
+              <w:t xml:space="preserve">Ties to double-booking radar</w:t>
+            </w:r>
+          </w:p>
+        </w:tc>
+      </w:tr>
+      <w:tr>
+        <w:trPr>
+          <w:cantSplit/>
+        </w:trPr>
+        <w:tc>
+          <w:tcPr>
+            <w:vAlign w:val="center"/>
+          </w:tcPr>
+          <w:p>
+            <w:pPr>
+              <w:pStyle w:val="MdTableCell"/>
+            </w:pPr>
+            <w:r>
+              <w:t xml:space="preserve">Channel preferences (email / SMS / WhatsApp)</w:t>
+            </w:r>
+          </w:p>
+        </w:tc>
+        <w:tc>
+          <w:tcPr>
+            <w:vAlign w:val="center"/>
+          </w:tcPr>
+          <w:p>
+            <w:pPr>
+              <w:pStyle w:val="MdTableCell"/>
+            </w:pPr>
+            <w:r>
+              <w:rPr>
+                <w:rStyle w:val="MdTag"/>
+              </w:rPr>
+              <w:t xml:space="preserve">&lt;span class="tag new"&gt;</w:t>
+            </w:r>
+            <w:r>
+              <w:t xml:space="preserve">NEW</w:t>
+            </w:r>
+            <w:r>
+              <w:rPr>
+                <w:rStyle w:val="MdTag"/>
+              </w:rPr>
+              <w:t xml:space="preserve">&lt;/span&gt;</w:t>
+            </w:r>
+          </w:p>
+        </w:tc>
+        <w:tc>
+          <w:tcPr>
+            <w:vAlign w:val="center"/>
+          </w:tcPr>
+          <w:p>
+            <w:pPr>
+              <w:pStyle w:val="MdTableCell"/>
+            </w:pPr>
+          </w:p>
+        </w:tc>
+      </w:tr>
+      <w:tr>
+        <w:trPr>
+          <w:cantSplit/>
+        </w:trPr>
+        <w:tc>
+          <w:tcPr>
+            <w:vAlign w:val="center"/>
+          </w:tcPr>
+          <w:p>
+            <w:pPr>
+              <w:pStyle w:val="MdTableCell"/>
+            </w:pPr>
+            <w:r>
+              <w:t xml:space="preserve">Daily / weekly digest</w:t>
+            </w:r>
+          </w:p>
+        </w:tc>
+        <w:tc>
+          <w:tcPr>
+            <w:vAlign w:val="center"/>
+          </w:tcPr>
+          <w:p>
+            <w:pPr>
+              <w:pStyle w:val="MdTableCell"/>
+            </w:pPr>
+            <w:r>
+              <w:rPr>
+                <w:rStyle w:val="MdTag"/>
+              </w:rPr>
+              <w:t xml:space="preserve">&lt;span class="tag new"&gt;</w:t>
+            </w:r>
+            <w:r>
+              <w:t xml:space="preserve">NEW</w:t>
+            </w:r>
+            <w:r>
+              <w:rPr>
+                <w:rStyle w:val="MdTag"/>
+              </w:rPr>
+              <w:t xml:space="preserve">&lt;/span&gt;</w:t>
+            </w:r>
+          </w:p>
+        </w:tc>
+        <w:tc>
+          <w:tcPr>
+            <w:vAlign w:val="center"/>
+          </w:tcPr>
+          <w:p>
+            <w:pPr>
+              <w:pStyle w:val="MdTableCell"/>
+            </w:pPr>
+          </w:p>
+        </w:tc>
+      </w:tr>
+    </w:tbl>
+    <w:p>
+      <w:pPr>
+        <w:pStyle w:val="Heading2"/>
+        <w:pStyle w:val="MdHeading2"/>
+      </w:pPr>
+      <w:r>
+        <w:t xml:space="preserve">20 · </w:t>
+      </w:r>
+      <w:r>
+        <w:rPr>
+          <w:rStyle w:val="MdTag"/>
+        </w:rPr>
+        <w:t xml:space="preserve">&lt;span class="grpnum"&gt;</w:t>
+      </w:r>
+      <w:r>
+        <w:t xml:space="preserve">Account, Security &amp;amp; Data</w:t>
+      </w:r>
+      <w:r>
+        <w:rPr>
+          <w:rStyle w:val="MdTag"/>
+        </w:rPr>
+        <w:t xml:space="preserve">&lt;/span&gt;</w:t>
+      </w:r>
+    </w:p>
+    <w:tbl>
+      <w:tblPr>
+        <w:tblStyle w:val="MdTable"/>
+        <w:tblW w:type="pct" w:w="100%"/>
+        <w:tblBorders>
+          <w:top w:val="single" w:color="auto" w:sz="4"/>
+          <w:left w:val="single" w:color="auto" w:sz="4"/>
+          <w:bottom w:val="single" w:color="auto" w:sz="4"/>
+          <w:right w:val="single" w:color="auto" w:sz="4"/>
+          <w:insideH w:val="single" w:color="auto" w:sz="4"/>
+          <w:insideV w:val="single" w:color="auto" w:sz="4"/>
+        </w:tblBorders>
+      </w:tblPr>
+      <w:tblGrid>
+        <w:gridCol w:w="3333"/>
+        <w:gridCol w:w="3333"/>
+        <w:gridCol w:w="3333"/>
+      </w:tblGrid>
+      <w:tr>
+        <w:trPr>
+          <w:cantSplit/>
+          <w:tblHeader/>
+        </w:trPr>
+        <w:tc>
+          <w:tcPr>
+            <w:shd w:fill="F2F2F2"/>
+            <w:vAlign w:val="center"/>
+          </w:tcPr>
+          <w:p>
+            <w:pPr>
+              <w:pStyle w:val="MdTableHeader"/>
+            </w:pPr>
+            <w:r>
+              <w:t xml:space="preserve">Feature</w:t>
+            </w:r>
+          </w:p>
+        </w:tc>
+        <w:tc>
+          <w:tcPr>
+            <w:shd w:fill="F2F2F2"/>
+            <w:vAlign w:val="center"/>
+          </w:tcPr>
+          <w:p>
+            <w:pPr>
+              <w:pStyle w:val="MdTableHeader"/>
+            </w:pPr>
+            <w:r>
+              <w:t xml:space="preserve">Status</w:t>
+            </w:r>
+          </w:p>
+        </w:tc>
+        <w:tc>
+          <w:tcPr>
+            <w:shd w:fill="F2F2F2"/>
+            <w:vAlign w:val="center"/>
+          </w:tcPr>
+          <w:p>
+            <w:pPr>
+              <w:pStyle w:val="MdTableHeader"/>
+            </w:pPr>
+            <w:r>
+              <w:t xml:space="preserve">Notes</w:t>
+            </w:r>
+          </w:p>
+        </w:tc>
+      </w:tr>
+      <w:tr>
+        <w:trPr>
+          <w:cantSplit/>
+        </w:trPr>
+        <w:tc>
+          <w:tcPr>
+            <w:vAlign w:val="center"/>
+          </w:tcPr>
+          <w:p>
+            <w:pPr>
+              <w:pStyle w:val="MdTableCell"/>
+            </w:pPr>
+            <w:r>
+              <w:t xml:space="preserve">Account security (2FA, login alerts)</w:t>
+            </w:r>
+          </w:p>
+        </w:tc>
+        <w:tc>
+          <w:tcPr>
+            <w:vAlign w:val="center"/>
+          </w:tcPr>
+          <w:p>
+            <w:pPr>
+              <w:pStyle w:val="MdTableCell"/>
+            </w:pPr>
+            <w:r>
+              <w:rPr>
+                <w:rStyle w:val="MdTag"/>
+              </w:rPr>
+              <w:t xml:space="preserve">&lt;span class="tag new"&gt;</w:t>
+            </w:r>
+            <w:r>
+              <w:t xml:space="preserve">NEW</w:t>
+            </w:r>
+            <w:r>
+              <w:rPr>
+                <w:rStyle w:val="MdTag"/>
+              </w:rPr>
+              <w:t xml:space="preserve">&lt;/span&gt;</w:t>
+            </w:r>
+          </w:p>
+        </w:tc>
+        <w:tc>
+          <w:tcPr>
+            <w:vAlign w:val="center"/>
+          </w:tcPr>
+          <w:p>
+            <w:pPr>
+              <w:pStyle w:val="MdTableCell"/>
+            </w:pPr>
+          </w:p>
+        </w:tc>
+      </w:tr>
+      <w:tr>
+        <w:trPr>
+          <w:cantSplit/>
+        </w:trPr>
+        <w:tc>
+          <w:tcPr>
+            <w:vAlign w:val="center"/>
+          </w:tcPr>
+          <w:p>
+            <w:pPr>
+              <w:pStyle w:val="MdTableCell"/>
+            </w:pPr>
+            <w:r>
+              <w:t xml:space="preserve">Session / device management</w:t>
+            </w:r>
+          </w:p>
+        </w:tc>
+        <w:tc>
+          <w:tcPr>
+            <w:vAlign w:val="center"/>
+          </w:tcPr>
+          <w:p>
+            <w:pPr>
+              <w:pStyle w:val="MdTableCell"/>
+            </w:pPr>
+            <w:r>
+              <w:rPr>
+                <w:rStyle w:val="MdTag"/>
+              </w:rPr>
+              <w:t xml:space="preserve">&lt;span class="tag new"&gt;</w:t>
+            </w:r>
+            <w:r>
+              <w:t xml:space="preserve">NEW</w:t>
+            </w:r>
+            <w:r>
+              <w:rPr>
+                <w:rStyle w:val="MdTag"/>
+              </w:rPr>
+              <w:t xml:space="preserve">&lt;/span&gt;</w:t>
+            </w:r>
+          </w:p>
+        </w:tc>
+        <w:tc>
+          <w:tcPr>
+            <w:vAlign w:val="center"/>
+          </w:tcPr>
+          <w:p>
+            <w:pPr>
+              <w:pStyle w:val="MdTableCell"/>
+            </w:pPr>
+          </w:p>
+        </w:tc>
+      </w:tr>
+      <w:tr>
+        <w:trPr>
+          <w:cantSplit/>
+        </w:trPr>
+        <w:tc>
+          <w:tcPr>
+            <w:vAlign w:val="center"/>
+          </w:tcPr>
+          <w:p>
+            <w:pPr>
+              <w:pStyle w:val="MdTableCell"/>
+            </w:pPr>
+            <w:r>
+              <w:t xml:space="preserve">Owner data export (bookings, guests, financials)</w:t>
+            </w:r>
+          </w:p>
+        </w:tc>
+        <w:tc>
+          <w:tcPr>
+            <w:vAlign w:val="center"/>
+          </w:tcPr>
+          <w:p>
+            <w:pPr>
+              <w:pStyle w:val="MdTableCell"/>
+            </w:pPr>
+            <w:r>
+              <w:rPr>
+                <w:rStyle w:val="MdTag"/>
+              </w:rPr>
+              <w:t xml:space="preserve">&lt;span class="tag new"&gt;</w:t>
+            </w:r>
+            <w:r>
+              <w:t xml:space="preserve">NEW</w:t>
+            </w:r>
+            <w:r>
+              <w:rPr>
+                <w:rStyle w:val="MdTag"/>
+              </w:rPr>
+              <w:t xml:space="preserve">&lt;/span&gt;</w:t>
+            </w:r>
+          </w:p>
+        </w:tc>
+        <w:tc>
+          <w:tcPr>
+            <w:vAlign w:val="center"/>
+          </w:tcPr>
+          <w:p>
+            <w:pPr>
+              <w:pStyle w:val="MdTableCell"/>
+            </w:pPr>
+          </w:p>
+        </w:tc>
+      </w:tr>
+      <w:tr>
+        <w:trPr>
+          <w:cantSplit/>
+        </w:trPr>
+        <w:tc>
+          <w:tcPr>
+            <w:vAlign w:val="center"/>
+          </w:tcPr>
+          <w:p>
+            <w:pPr>
+              <w:pStyle w:val="MdTableCell"/>
+            </w:pPr>
+            <w:r>
+              <w:t xml:space="preserve">Account deletion / DSAR workflow</w:t>
+            </w:r>
+          </w:p>
+        </w:tc>
+        <w:tc>
+          <w:tcPr>
+            <w:vAlign w:val="center"/>
+          </w:tcPr>
+          <w:p>
+            <w:pPr>
+              <w:pStyle w:val="MdTableCell"/>
+            </w:pPr>
+            <w:r>
+              <w:rPr>
+                <w:rStyle w:val="MdTag"/>
+              </w:rPr>
+              <w:t xml:space="preserve">&lt;span class="tag new"&gt;</w:t>
+            </w:r>
+            <w:r>
+              <w:t xml:space="preserve">NEW</w:t>
+            </w:r>
+            <w:r>
+              <w:rPr>
+                <w:rStyle w:val="MdTag"/>
+              </w:rPr>
+              <w:t xml:space="preserve">&lt;/span&gt;</w:t>
+            </w:r>
+          </w:p>
+        </w:tc>
+        <w:tc>
+          <w:tcPr>
+            <w:vAlign w:val="center"/>
+          </w:tcPr>
+          <w:p>
+            <w:pPr>
+              <w:pStyle w:val="MdTableCell"/>
+            </w:pPr>
+            <w:r>
+              <w:t xml:space="preserve">Compliance</w:t>
+            </w:r>
+          </w:p>
+        </w:tc>
+      </w:tr>
+      <w:tr>
+        <w:trPr>
+          <w:cantSplit/>
+        </w:trPr>
+        <w:tc>
+          <w:tcPr>
+            <w:vAlign w:val="center"/>
+          </w:tcPr>
+          <w:p>
+            <w:pPr>
+              <w:pStyle w:val="MdTableCell"/>
+            </w:pPr>
+            <w:r>
+              <w:t xml:space="preserve">Staff roles &amp;amp; permissions</w:t>
+            </w:r>
+          </w:p>
+        </w:tc>
+        <w:tc>
+          <w:tcPr>
+            <w:vAlign w:val="center"/>
+          </w:tcPr>
+          <w:p>
+            <w:pPr>
+              <w:pStyle w:val="MdTableCell"/>
+            </w:pPr>
+            <w:r>
+              <w:rPr>
+                <w:rStyle w:val="MdTag"/>
+              </w:rPr>
+              <w:t xml:space="preserve">&lt;span class="tag new"&gt;</w:t>
+            </w:r>
+            <w:r>
+              <w:t xml:space="preserve">NEW</w:t>
+            </w:r>
+            <w:r>
+              <w:rPr>
+                <w:rStyle w:val="MdTag"/>
+              </w:rPr>
+              <w:t xml:space="preserve">&lt;/span&gt;</w:t>
+            </w:r>
+          </w:p>
+        </w:tc>
+        <w:tc>
+          <w:tcPr>
+            <w:vAlign w:val="center"/>
+          </w:tcPr>
+          <w:p>
+            <w:pPr>
+              <w:pStyle w:val="MdTableCell"/>
+            </w:pPr>
+            <w:r>
+              <w:t xml:space="preserve">Caretaker + future roles</w:t>
+            </w:r>
+          </w:p>
+        </w:tc>
+      </w:tr>
+      <w:tr>
+        <w:trPr>
+          <w:cantSplit/>
+        </w:trPr>
+        <w:tc>
+          <w:tcPr>
+            <w:vAlign w:val="center"/>
+          </w:tcPr>
+          <w:p>
+            <w:pPr>
+              <w:pStyle w:val="MdTableCell"/>
+            </w:pPr>
+            <w:r>
+              <w:t xml:space="preserve">Activity / audit log</w:t>
+            </w:r>
+          </w:p>
+        </w:tc>
+        <w:tc>
+          <w:tcPr>
+            <w:vAlign w:val="center"/>
+          </w:tcPr>
+          <w:p>
+            <w:pPr>
+              <w:pStyle w:val="MdTableCell"/>
+            </w:pPr>
+            <w:r>
+              <w:rPr>
+                <w:rStyle w:val="MdTag"/>
+              </w:rPr>
+              <w:t xml:space="preserve">&lt;span class="tag new"&gt;</w:t>
+            </w:r>
+            <w:r>
+              <w:t xml:space="preserve">NEW</w:t>
+            </w:r>
+            <w:r>
+              <w:rPr>
+                <w:rStyle w:val="MdTag"/>
+              </w:rPr>
+              <w:t xml:space="preserve">&lt;/span&gt;</w:t>
+            </w:r>
+          </w:p>
+        </w:tc>
+        <w:tc>
+          <w:tcPr>
+            <w:vAlign w:val="center"/>
+          </w:tcPr>
+          <w:p>
+            <w:pPr>
+              <w:pStyle w:val="MdTableCell"/>
+            </w:pPr>
+          </w:p>
+        </w:tc>
+      </w:tr>
+    </w:tbl>
+    <w:p>
+      <w:pPr>
         <w:pStyle w:val="MdHr"/>
         <w:pBdr>
           <w:bottom w:val="single" w:color="auto" w:sz="6" w:space="1"/>
@@ -9271,7 +11237,7 @@
       </w:r>
       <w:r>
         <w:br/>
-        <w:t xml:space="preserve">&lt;p&gt;&lt;strong&gt;What this exercise surfaced (highest-value NEW items):&lt;/strong&gt; a &lt;strong&gt;promo-code &amp;amp; discount engine&lt;/strong&gt; (your price-tiers-including-free requirement), a &lt;strong&gt;refunds + deposit-claim flow&lt;/strong&gt; (missing from payments), a &lt;strong&gt;guest portal&lt;/strong&gt; (renter side is thin today), &lt;strong&gt;subscription/billing management&lt;/strong&gt; (trial→paid, cancel, dunning), and &lt;strong&gt;cancellation/modification&lt;/strong&gt; in the booking process. These are the gaps to scope next.&lt;/p&gt;</w:t>
+        <w:t xml:space="preserve">&lt;p&gt;&lt;strong&gt;What this exercise surfaced (highest-value NEW items):&lt;/strong&gt; a central &lt;strong&gt;Owner Settings page&lt;/strong&gt; (policies + parameters, incl. cleaning fee as fixed or per-day), a &lt;strong&gt;promo-code &amp;amp; discount engine&lt;/strong&gt; (your price-tiers-including-free requirement), a &lt;strong&gt;refunds + deposit-claim flow&lt;/strong&gt;, a &lt;strong&gt;guest portal&lt;/strong&gt;, &lt;strong&gt;subscription/billing management&lt;/strong&gt; (trial→paid, cancel, dunning), &lt;strong&gt;cancellation/modification&lt;/strong&gt; in booking, &lt;strong&gt;owner notifications&lt;/strong&gt;, &lt;strong&gt;invoicing/receipts incl. Mexican CFDI&lt;/strong&gt;, and &lt;strong&gt;account security + data export/deletion&lt;/strong&gt;. These are the gaps to scope next for a fully functioning system.&lt;/p&gt;</w:t>
       </w:r>
       <w:r>
         <w:br/>

</xml_diff>